<commit_message>
Updated Nathan new wireframes
</commit_message>
<xml_diff>
--- a/Requirements/UseCasesPhase1/DiscussionPoints.docx
+++ b/Requirements/UseCasesPhase1/DiscussionPoints.docx
@@ -1,6 +1,6 @@
 
 <file path=word/document.xml><?xml version="1.0" encoding="utf-8"?>
-<w:document xmlns:wpc="http://schemas.microsoft.com/office/word/2010/wordprocessingCanvas" xmlns:cx="http://schemas.microsoft.com/office/drawing/2014/chartex" xmlns:cx1="http://schemas.microsoft.com/office/drawing/2015/9/8/chartex" xmlns:cx2="http://schemas.microsoft.com/office/drawing/2015/10/21/chartex" xmlns:cx3="http://schemas.microsoft.com/office/drawing/2016/5/9/chartex" xmlns:cx4="http://schemas.microsoft.com/office/drawing/2016/5/10/chartex" xmlns:cx5="http://schemas.microsoft.com/office/drawing/2016/5/11/chartex" xmlns:cx6="http://schemas.microsoft.com/office/drawing/2016/5/12/chartex" xmlns:cx7="http://schemas.microsoft.com/office/drawing/2016/5/13/chartex" xmlns:cx8="http://schemas.microsoft.com/office/drawing/2016/5/14/chartex" xmlns:mc="http://schemas.openxmlformats.org/markup-compatibility/2006" xmlns:aink="http://schemas.microsoft.com/office/drawing/2016/ink" xmlns:am3d="http://schemas.microsoft.com/office/drawing/2017/model3d" xmlns:o="urn:schemas-microsoft-com:office:office" xmlns:oel="http://schemas.microsoft.com/office/2019/extlst" xmlns:r="http://schemas.openxmlformats.org/officeDocument/2006/relationships" xmlns:m="http://schemas.openxmlformats.org/officeDocument/2006/math" xmlns:v="urn:schemas-microsoft-com:vml" xmlns:wp14="http://schemas.microsoft.com/office/word/2010/wordprocessingDrawing" xmlns:wp="http://schemas.openxmlformats.org/drawingml/2006/wordprocessingDrawing" xmlns:w10="urn:schemas-microsoft-com:office:word" xmlns:w="http://schemas.openxmlformats.org/wordprocessingml/2006/main" xmlns:w14="http://schemas.microsoft.com/office/word/2010/wordml" xmlns:w15="http://schemas.microsoft.com/office/word/2012/wordml" xmlns:w16cex="http://schemas.microsoft.com/office/word/2018/wordml/cex" xmlns:w16cid="http://schemas.microsoft.com/office/word/2016/wordml/cid" xmlns:w16="http://schemas.microsoft.com/office/word/2018/wordml" xmlns:w16du="http://schemas.microsoft.com/office/word/2023/wordml/word16du" xmlns:w16sdtdh="http://schemas.microsoft.com/office/word/2020/wordml/sdtdatahash" xmlns:w16sdtfl="http://schemas.microsoft.com/office/word/2024/wordml/sdtformatlock" xmlns:w16se="http://schemas.microsoft.com/office/word/2015/wordml/symex" xmlns:wpg="http://schemas.microsoft.com/office/word/2010/wordprocessingGroup" xmlns:wpi="http://schemas.microsoft.com/office/word/2010/wordprocessingInk" xmlns:wne="http://schemas.microsoft.com/office/word/2006/wordml" xmlns:wps="http://schemas.microsoft.com/office/word/2010/wordprocessingShape" mc:Ignorable="w14 w15 w16se w16cid w16 w16cex w16sdtdh w16sdtfl w16du wp14">
+<w:document xmlns:wpc="http://schemas.microsoft.com/office/word/2010/wordprocessingCanvas" xmlns:cx="http://schemas.microsoft.com/office/drawing/2014/chartex" xmlns:cx1="http://schemas.microsoft.com/office/drawing/2015/9/8/chartex" xmlns:cx2="http://schemas.microsoft.com/office/drawing/2015/10/21/chartex" xmlns:cx3="http://schemas.microsoft.com/office/drawing/2016/5/9/chartex" xmlns:cx4="http://schemas.microsoft.com/office/drawing/2016/5/10/chartex" xmlns:cx5="http://schemas.microsoft.com/office/drawing/2016/5/11/chartex" xmlns:cx6="http://schemas.microsoft.com/office/drawing/2016/5/12/chartex" xmlns:cx7="http://schemas.microsoft.com/office/drawing/2016/5/13/chartex" xmlns:cx8="http://schemas.microsoft.com/office/drawing/2016/5/14/chartex" xmlns:mc="http://schemas.openxmlformats.org/markup-compatibility/2006" xmlns:m="http://schemas.openxmlformats.org/officeDocument/2006/math" xmlns:aink="http://schemas.microsoft.com/office/drawing/2016/ink" xmlns:am3d="http://schemas.microsoft.com/office/drawing/2017/model3d" xmlns:oel="http://schemas.microsoft.com/office/2019/extlst" xmlns:r="http://schemas.openxmlformats.org/officeDocument/2006/relationships" xmlns:wp14="http://schemas.microsoft.com/office/word/2010/wordprocessingDrawing" xmlns:wp="http://schemas.openxmlformats.org/drawingml/2006/wordprocessingDrawing" xmlns:wpg="http://schemas.microsoft.com/office/word/2010/wordprocessingGroup" xmlns:wpi="http://schemas.microsoft.com/office/word/2010/wordprocessingInk" xmlns:wps="http://schemas.microsoft.com/office/word/2010/wordprocessingShape" xmlns:o="urn:schemas-microsoft-com:office:office" xmlns:v="urn:schemas-microsoft-com:vml" xmlns:w10="urn:schemas-microsoft-com:office:word" xmlns:w="http://schemas.openxmlformats.org/wordprocessingml/2006/main" xmlns:w14="http://schemas.microsoft.com/office/word/2010/wordml" xmlns:w15="http://schemas.microsoft.com/office/word/2012/wordml" xmlns:w16cex="http://schemas.microsoft.com/office/word/2018/wordml/cex" xmlns:w16cid="http://schemas.microsoft.com/office/word/2016/wordml/cid" xmlns:w16="http://schemas.microsoft.com/office/word/2018/wordml" xmlns:w16sdtdh="http://schemas.microsoft.com/office/word/2020/wordml/sdtdatahash" xmlns:w16sdtfl="http://schemas.microsoft.com/office/word/2024/wordml/sdtformatlock" xmlns:w16se="http://schemas.microsoft.com/office/word/2015/wordml/symex" xmlns:w16du="http://schemas.microsoft.com/office/word/2023/wordml/word16du" xmlns:wne="http://schemas.microsoft.com/office/word/2006/wordml" mc:Ignorable="w14 w15 w16se w16cid w16 w16cex w16sdtdh w16sdtfl w16du wp14">
   <w:body>
     <w:p>
       <w:pPr>
@@ -154,8 +154,8 @@
         <w:tblLook w:val="04A0" w:firstRow="1" w:lastRow="0" w:firstColumn="1" w:lastColumn="0" w:noHBand="0" w:noVBand="1"/>
       </w:tblPr>
       <w:tblGrid>
-        <w:gridCol w:w="5934"/>
-        <w:gridCol w:w="3082"/>
+        <w:gridCol w:w="5942"/>
+        <w:gridCol w:w="3074"/>
         <w:gridCol w:w="5"/>
         <w:gridCol w:w="5"/>
       </w:tblGrid>
@@ -209,8 +209,22 @@
                       <w:szCs w:val="27"/>
                       <w:lang w:eastAsia="en-AU"/>
                     </w:rPr>
-                    <w:t>Alum Sheila Uyirwoth</w:t>
+                    <w:t xml:space="preserve">Alum Sheila </w:t>
                   </w:r>
+                  <w:proofErr w:type="spellStart"/>
+                  <w:r>
+                    <w:rPr>
+                      <w:rFonts w:ascii="Helvetica" w:eastAsia="Times New Roman" w:hAnsi="Helvetica" w:cs="Helvetica"/>
+                      <w:b/>
+                      <w:bCs/>
+                      <w:color w:val="1F1F1F"/>
+                      <w:sz w:val="27"/>
+                      <w:szCs w:val="27"/>
+                      <w:lang w:eastAsia="en-AU"/>
+                    </w:rPr>
+                    <w:t>Uyirwoth</w:t>
+                  </w:r>
+                  <w:proofErr w:type="spellEnd"/>
                 </w:p>
               </w:tc>
             </w:tr>
@@ -493,7 +507,29 @@
           <w:szCs w:val="24"/>
           <w:lang w:eastAsia="en-AU"/>
         </w:rPr>
-        <w:t>Please see the following four user journeys designed for CheckUpp:</w:t>
+        <w:t>Please see the following four user journeys designed for </w:t>
+      </w:r>
+      <w:proofErr w:type="spellStart"/>
+      <w:r>
+        <w:rPr>
+          <w:rFonts w:ascii="Arial" w:eastAsia="Times New Roman" w:hAnsi="Arial" w:cs="Arial"/>
+          <w:color w:val="222222"/>
+          <w:sz w:val="24"/>
+          <w:szCs w:val="24"/>
+          <w:lang w:eastAsia="en-AU"/>
+        </w:rPr>
+        <w:t>CheckUpp</w:t>
+      </w:r>
+      <w:proofErr w:type="spellEnd"/>
+      <w:r>
+        <w:rPr>
+          <w:rFonts w:ascii="Arial" w:eastAsia="Times New Roman" w:hAnsi="Arial" w:cs="Arial"/>
+          <w:color w:val="222222"/>
+          <w:sz w:val="24"/>
+          <w:szCs w:val="24"/>
+          <w:lang w:eastAsia="en-AU"/>
+        </w:rPr>
+        <w:t>:</w:t>
       </w:r>
     </w:p>
     <w:p>
@@ -868,7 +904,27 @@
                 <w:szCs w:val="20"/>
                 <w:lang w:eastAsia="en-AU"/>
               </w:rPr>
-              <w:t>Mia logs into CheckUpp and selects the pregnancy icon from the home screen.</w:t>
+              <w:t xml:space="preserve">Mia logs into </w:t>
+            </w:r>
+            <w:proofErr w:type="spellStart"/>
+            <w:r>
+              <w:rPr>
+                <w:rFonts w:ascii="Arial" w:eastAsia="Times New Roman" w:hAnsi="Arial" w:cs="Arial"/>
+                <w:sz w:val="20"/>
+                <w:szCs w:val="20"/>
+                <w:lang w:eastAsia="en-AU"/>
+              </w:rPr>
+              <w:t>CheckUpp</w:t>
+            </w:r>
+            <w:proofErr w:type="spellEnd"/>
+            <w:r>
+              <w:rPr>
+                <w:rFonts w:ascii="Arial" w:eastAsia="Times New Roman" w:hAnsi="Arial" w:cs="Arial"/>
+                <w:sz w:val="20"/>
+                <w:szCs w:val="20"/>
+                <w:lang w:eastAsia="en-AU"/>
+              </w:rPr>
+              <w:t xml:space="preserve"> and selects the pregnancy icon from the home screen.</w:t>
             </w:r>
           </w:p>
         </w:tc>
@@ -2415,7 +2471,27 @@
                 <w:szCs w:val="24"/>
                 <w:lang w:eastAsia="en-AU"/>
               </w:rPr>
-              <w:t> for link to HotDocs or direct number or email to practice</w:t>
+              <w:t xml:space="preserve"> for link to </w:t>
+            </w:r>
+            <w:proofErr w:type="spellStart"/>
+            <w:r>
+              <w:rPr>
+                <w:rFonts w:ascii="Arial" w:eastAsia="Times New Roman" w:hAnsi="Arial" w:cs="Arial"/>
+                <w:sz w:val="24"/>
+                <w:szCs w:val="24"/>
+                <w:lang w:eastAsia="en-AU"/>
+              </w:rPr>
+              <w:t>HotDocs</w:t>
+            </w:r>
+            <w:proofErr w:type="spellEnd"/>
+            <w:r>
+              <w:rPr>
+                <w:rFonts w:ascii="Arial" w:eastAsia="Times New Roman" w:hAnsi="Arial" w:cs="Arial"/>
+                <w:sz w:val="24"/>
+                <w:szCs w:val="24"/>
+                <w:lang w:eastAsia="en-AU"/>
+              </w:rPr>
+              <w:t xml:space="preserve"> or direct number or email to practice</w:t>
             </w:r>
           </w:p>
           <w:p>
@@ -2493,8 +2569,19 @@
                 <w:szCs w:val="24"/>
                 <w:lang w:eastAsia="en-AU"/>
               </w:rPr>
-              <w:t>App integrates with local software / call or email to book an appointment .</w:t>
-            </w:r>
+              <w:t xml:space="preserve">App integrates with local software / call or email to book an </w:t>
+            </w:r>
+            <w:proofErr w:type="gramStart"/>
+            <w:r>
+              <w:rPr>
+                <w:rFonts w:ascii="Arial" w:eastAsia="Times New Roman" w:hAnsi="Arial" w:cs="Arial"/>
+                <w:sz w:val="24"/>
+                <w:szCs w:val="24"/>
+                <w:lang w:eastAsia="en-AU"/>
+              </w:rPr>
+              <w:t>appointment .</w:t>
+            </w:r>
+            <w:proofErr w:type="gramEnd"/>
           </w:p>
           <w:p>
             <w:pPr>
@@ -4339,8 +4426,21 @@
             <w:u w:val="single"/>
             <w:lang w:eastAsia="en-AU"/>
           </w:rPr>
-          <w:t>Check Upp</w:t>
+          <w:t xml:space="preserve">Check </w:t>
         </w:r>
+        <w:proofErr w:type="spellStart"/>
+        <w:r>
+          <w:rPr>
+            <w:rFonts w:ascii="Arial" w:eastAsia="Times New Roman" w:hAnsi="Arial" w:cs="Arial"/>
+            <w:color w:val="1155CC"/>
+            <w:sz w:val="20"/>
+            <w:szCs w:val="20"/>
+            <w:u w:val="single"/>
+            <w:lang w:eastAsia="en-AU"/>
+          </w:rPr>
+          <w:t>Upp</w:t>
+        </w:r>
+        <w:proofErr w:type="spellEnd"/>
       </w:hyperlink>
       <w:r>
         <w:rPr>
@@ -4554,8 +4654,8 @@
         <w:tblLook w:val="04A0" w:firstRow="1" w:lastRow="0" w:firstColumn="1" w:lastColumn="0" w:noHBand="0" w:noVBand="1"/>
       </w:tblPr>
       <w:tblGrid>
-        <w:gridCol w:w="5909"/>
-        <w:gridCol w:w="3107"/>
+        <w:gridCol w:w="5917"/>
+        <w:gridCol w:w="3099"/>
         <w:gridCol w:w="5"/>
         <w:gridCol w:w="5"/>
       </w:tblGrid>
@@ -4609,8 +4709,22 @@
                       <w:szCs w:val="27"/>
                       <w:lang w:eastAsia="en-AU"/>
                     </w:rPr>
-                    <w:t>Alum Sheila Uyirwoth</w:t>
+                    <w:t xml:space="preserve">Alum Sheila </w:t>
                   </w:r>
+                  <w:proofErr w:type="spellStart"/>
+                  <w:r>
+                    <w:rPr>
+                      <w:rFonts w:ascii="Helvetica" w:eastAsia="Times New Roman" w:hAnsi="Helvetica" w:cs="Helvetica"/>
+                      <w:b/>
+                      <w:bCs/>
+                      <w:color w:val="1F1F1F"/>
+                      <w:sz w:val="27"/>
+                      <w:szCs w:val="27"/>
+                      <w:lang w:eastAsia="en-AU"/>
+                    </w:rPr>
+                    <w:t>Uyirwoth</w:t>
+                  </w:r>
+                  <w:proofErr w:type="spellEnd"/>
                 </w:p>
               </w:tc>
             </w:tr>
@@ -5190,8 +5304,21 @@
             <w:u w:val="single"/>
             <w:lang w:eastAsia="en-AU"/>
           </w:rPr>
-          <w:t>Check Upp</w:t>
+          <w:t xml:space="preserve">Check </w:t>
         </w:r>
+        <w:proofErr w:type="spellStart"/>
+        <w:r>
+          <w:rPr>
+            <w:rFonts w:ascii="Arial" w:eastAsia="Times New Roman" w:hAnsi="Arial" w:cs="Arial"/>
+            <w:color w:val="1155CC"/>
+            <w:sz w:val="20"/>
+            <w:szCs w:val="20"/>
+            <w:u w:val="single"/>
+            <w:lang w:eastAsia="en-AU"/>
+          </w:rPr>
+          <w:t>Upp</w:t>
+        </w:r>
+        <w:proofErr w:type="spellEnd"/>
       </w:hyperlink>
       <w:r>
         <w:rPr>
@@ -5425,7 +5552,31 @@
           <w:szCs w:val="24"/>
           <w:lang w:eastAsia="en-AU"/>
         </w:rPr>
-        <w:t>2. Compartmentalize the partial-save of</w:t>
+        <w:t xml:space="preserve">2. Compartmentalize the </w:t>
+      </w:r>
+      <w:proofErr w:type="gramStart"/>
+      <w:r>
+        <w:rPr>
+          <w:rFonts w:ascii="Times New Roman" w:eastAsia="Times New Roman" w:hAnsi="Times New Roman" w:cs="Times New Roman"/>
+          <w:b/>
+          <w:bCs/>
+          <w:sz w:val="24"/>
+          <w:szCs w:val="24"/>
+          <w:lang w:eastAsia="en-AU"/>
+        </w:rPr>
+        <w:t>partial-save</w:t>
+      </w:r>
+      <w:proofErr w:type="gramEnd"/>
+      <w:r>
+        <w:rPr>
+          <w:rFonts w:ascii="Times New Roman" w:eastAsia="Times New Roman" w:hAnsi="Times New Roman" w:cs="Times New Roman"/>
+          <w:b/>
+          <w:bCs/>
+          <w:sz w:val="24"/>
+          <w:szCs w:val="24"/>
+          <w:lang w:eastAsia="en-AU"/>
+        </w:rPr>
+        <w:t xml:space="preserve"> of</w:t>
       </w:r>
       <w:r>
         <w:rPr>
@@ -5816,8 +5967,9 @@
           <w:szCs w:val="24"/>
           <w:lang w:eastAsia="en-AU"/>
         </w:rPr>
-        <w:t>7. Add photo capture of pathological results</w:t>
-      </w:r>
+        <w:t xml:space="preserve">7. </w:t>
+      </w:r>
+      <w:bookmarkStart w:id="0" w:name="OLE_LINK1"/>
       <w:r>
         <w:rPr>
           <w:rFonts w:ascii="Times New Roman" w:eastAsia="Times New Roman" w:hAnsi="Times New Roman" w:cs="Times New Roman"/>
@@ -5827,7 +5979,30 @@
           <w:szCs w:val="24"/>
           <w:lang w:eastAsia="en-AU"/>
         </w:rPr>
-        <w:t xml:space="preserve"> (</w:t>
+        <w:t>Add photo capture of pathological results</w:t>
+      </w:r>
+      <w:r>
+        <w:rPr>
+          <w:rFonts w:ascii="Times New Roman" w:eastAsia="Times New Roman" w:hAnsi="Times New Roman" w:cs="Times New Roman"/>
+          <w:b/>
+          <w:bCs/>
+          <w:sz w:val="24"/>
+          <w:szCs w:val="24"/>
+          <w:lang w:eastAsia="en-AU"/>
+        </w:rPr>
+        <w:t xml:space="preserve"> </w:t>
+      </w:r>
+      <w:bookmarkEnd w:id="0"/>
+      <w:r>
+        <w:rPr>
+          <w:rFonts w:ascii="Times New Roman" w:eastAsia="Times New Roman" w:hAnsi="Times New Roman" w:cs="Times New Roman"/>
+          <w:b/>
+          <w:bCs/>
+          <w:sz w:val="24"/>
+          <w:szCs w:val="24"/>
+          <w:lang w:eastAsia="en-AU"/>
+        </w:rPr>
+        <w:t>(</w:t>
       </w:r>
       <w:r>
         <w:rPr>
@@ -6146,7 +6321,47 @@
           <w:szCs w:val="24"/>
           <w:lang w:eastAsia="en-AU"/>
         </w:rPr>
-        <w:t xml:space="preserve"> google calendar &amp; icloud already implemented already.</w:t>
+        <w:t xml:space="preserve"> </w:t>
+      </w:r>
+      <w:proofErr w:type="gramStart"/>
+      <w:r>
+        <w:rPr>
+          <w:rFonts w:ascii="Times New Roman" w:eastAsia="Times New Roman" w:hAnsi="Times New Roman" w:cs="Times New Roman"/>
+          <w:sz w:val="24"/>
+          <w:szCs w:val="24"/>
+          <w:lang w:eastAsia="en-AU"/>
+        </w:rPr>
+        <w:t>google</w:t>
+      </w:r>
+      <w:proofErr w:type="gramEnd"/>
+      <w:r>
+        <w:rPr>
+          <w:rFonts w:ascii="Times New Roman" w:eastAsia="Times New Roman" w:hAnsi="Times New Roman" w:cs="Times New Roman"/>
+          <w:sz w:val="24"/>
+          <w:szCs w:val="24"/>
+          <w:lang w:eastAsia="en-AU"/>
+        </w:rPr>
+        <w:t xml:space="preserve"> calendar &amp; </w:t>
+      </w:r>
+      <w:proofErr w:type="spellStart"/>
+      <w:r>
+        <w:rPr>
+          <w:rFonts w:ascii="Times New Roman" w:eastAsia="Times New Roman" w:hAnsi="Times New Roman" w:cs="Times New Roman"/>
+          <w:sz w:val="24"/>
+          <w:szCs w:val="24"/>
+          <w:lang w:eastAsia="en-AU"/>
+        </w:rPr>
+        <w:t>icloud</w:t>
+      </w:r>
+      <w:proofErr w:type="spellEnd"/>
+      <w:r>
+        <w:rPr>
+          <w:rFonts w:ascii="Times New Roman" w:eastAsia="Times New Roman" w:hAnsi="Times New Roman" w:cs="Times New Roman"/>
+          <w:sz w:val="24"/>
+          <w:szCs w:val="24"/>
+          <w:lang w:eastAsia="en-AU"/>
+        </w:rPr>
+        <w:t xml:space="preserve"> already implemented already.</w:t>
       </w:r>
     </w:p>
     <w:p>
@@ -6912,6 +7127,7 @@
         </w:rPr>
         <w:t xml:space="preserve">: </w:t>
       </w:r>
+      <w:proofErr w:type="spellStart"/>
       <w:r>
         <w:rPr>
           <w:rFonts w:ascii="Times New Roman" w:eastAsia="Times New Roman" w:hAnsi="Times New Roman" w:cs="Times New Roman"/>
@@ -6920,7 +7136,18 @@
           <w:szCs w:val="24"/>
           <w:lang w:eastAsia="en-AU"/>
         </w:rPr>
-        <w:t>json xml????</w:t>
+        <w:t>json</w:t>
+      </w:r>
+      <w:proofErr w:type="spellEnd"/>
+      <w:r>
+        <w:rPr>
+          <w:rFonts w:ascii="Times New Roman" w:eastAsia="Times New Roman" w:hAnsi="Times New Roman" w:cs="Times New Roman"/>
+          <w:color w:val="FF0000"/>
+          <w:sz w:val="24"/>
+          <w:szCs w:val="24"/>
+          <w:lang w:eastAsia="en-AU"/>
+        </w:rPr>
+        <w:t xml:space="preserve"> xml????</w:t>
       </w:r>
     </w:p>
     <w:p>
@@ -7586,7 +7813,27 @@
           <w:szCs w:val="24"/>
           <w:lang w:eastAsia="en-AU"/>
         </w:rPr>
-        <w:t>CICD pipeline + Dockerization + Kubernetes + IAC (Terraform)</w:t>
+        <w:t xml:space="preserve">CICD pipeline + </w:t>
+      </w:r>
+      <w:proofErr w:type="spellStart"/>
+      <w:r>
+        <w:rPr>
+          <w:rFonts w:ascii="Times New Roman" w:eastAsia="Times New Roman" w:hAnsi="Times New Roman" w:cs="Times New Roman"/>
+          <w:sz w:val="24"/>
+          <w:szCs w:val="24"/>
+          <w:lang w:eastAsia="en-AU"/>
+        </w:rPr>
+        <w:t>Dockerization</w:t>
+      </w:r>
+      <w:proofErr w:type="spellEnd"/>
+      <w:r>
+        <w:rPr>
+          <w:rFonts w:ascii="Times New Roman" w:eastAsia="Times New Roman" w:hAnsi="Times New Roman" w:cs="Times New Roman"/>
+          <w:sz w:val="24"/>
+          <w:szCs w:val="24"/>
+          <w:lang w:eastAsia="en-AU"/>
+        </w:rPr>
+        <w:t xml:space="preserve"> + Kubernetes + IAC (Terraform)</w:t>
       </w:r>
     </w:p>
     <w:p>
@@ -7728,7 +7975,29 @@
           <w:szCs w:val="24"/>
           <w:lang w:eastAsia="en-AU"/>
         </w:rPr>
-        <w:t>App link: CheckUpp Android</w:t>
+        <w:t xml:space="preserve">App link: </w:t>
+      </w:r>
+      <w:proofErr w:type="spellStart"/>
+      <w:r>
+        <w:rPr>
+          <w:rFonts w:ascii="Times New Roman" w:eastAsia="Times New Roman" w:hAnsi="Times New Roman" w:cs="Times New Roman"/>
+          <w:b/>
+          <w:sz w:val="24"/>
+          <w:szCs w:val="24"/>
+          <w:lang w:eastAsia="en-AU"/>
+        </w:rPr>
+        <w:t>CheckUpp</w:t>
+      </w:r>
+      <w:proofErr w:type="spellEnd"/>
+      <w:r>
+        <w:rPr>
+          <w:rFonts w:ascii="Times New Roman" w:eastAsia="Times New Roman" w:hAnsi="Times New Roman" w:cs="Times New Roman"/>
+          <w:b/>
+          <w:sz w:val="24"/>
+          <w:szCs w:val="24"/>
+          <w:lang w:eastAsia="en-AU"/>
+        </w:rPr>
+        <w:t xml:space="preserve"> Android</w:t>
       </w:r>
     </w:p>
     <w:p>
@@ -7799,7 +8068,7 @@
 </file>
 
 <file path=word/numbering.xml><?xml version="1.0" encoding="utf-8"?>
-<w:numbering xmlns:wpc="http://schemas.microsoft.com/office/word/2010/wordprocessingCanvas" xmlns:cx="http://schemas.microsoft.com/office/drawing/2014/chartex" xmlns:cx1="http://schemas.microsoft.com/office/drawing/2015/9/8/chartex" xmlns:cx2="http://schemas.microsoft.com/office/drawing/2015/10/21/chartex" xmlns:cx3="http://schemas.microsoft.com/office/drawing/2016/5/9/chartex" xmlns:cx4="http://schemas.microsoft.com/office/drawing/2016/5/10/chartex" xmlns:cx5="http://schemas.microsoft.com/office/drawing/2016/5/11/chartex" xmlns:cx6="http://schemas.microsoft.com/office/drawing/2016/5/12/chartex" xmlns:cx7="http://schemas.microsoft.com/office/drawing/2016/5/13/chartex" xmlns:cx8="http://schemas.microsoft.com/office/drawing/2016/5/14/chartex" xmlns:mc="http://schemas.openxmlformats.org/markup-compatibility/2006" xmlns:aink="http://schemas.microsoft.com/office/drawing/2016/ink" xmlns:am3d="http://schemas.microsoft.com/office/drawing/2017/model3d" xmlns:o="urn:schemas-microsoft-com:office:office" xmlns:oel="http://schemas.microsoft.com/office/2019/extlst" xmlns:r="http://schemas.openxmlformats.org/officeDocument/2006/relationships" xmlns:m="http://schemas.openxmlformats.org/officeDocument/2006/math" xmlns:v="urn:schemas-microsoft-com:vml" xmlns:wp14="http://schemas.microsoft.com/office/word/2010/wordprocessingDrawing" xmlns:wp="http://schemas.openxmlformats.org/drawingml/2006/wordprocessingDrawing" xmlns:w10="urn:schemas-microsoft-com:office:word" xmlns:w="http://schemas.openxmlformats.org/wordprocessingml/2006/main" xmlns:w14="http://schemas.microsoft.com/office/word/2010/wordml" xmlns:w15="http://schemas.microsoft.com/office/word/2012/wordml" xmlns:w16cex="http://schemas.microsoft.com/office/word/2018/wordml/cex" xmlns:w16cid="http://schemas.microsoft.com/office/word/2016/wordml/cid" xmlns:w16="http://schemas.microsoft.com/office/word/2018/wordml" xmlns:w16du="http://schemas.microsoft.com/office/word/2023/wordml/word16du" xmlns:w16sdtdh="http://schemas.microsoft.com/office/word/2020/wordml/sdtdatahash" xmlns:w16sdtfl="http://schemas.microsoft.com/office/word/2024/wordml/sdtformatlock" xmlns:w16se="http://schemas.microsoft.com/office/word/2015/wordml/symex" xmlns:wpg="http://schemas.microsoft.com/office/word/2010/wordprocessingGroup" xmlns:wpi="http://schemas.microsoft.com/office/word/2010/wordprocessingInk" xmlns:wne="http://schemas.microsoft.com/office/word/2006/wordml" xmlns:wps="http://schemas.microsoft.com/office/word/2010/wordprocessingShape" mc:Ignorable="w14 w15 w16se w16cid w16 w16cex w16sdtdh w16sdtfl w16du wp14">
+<w:numbering xmlns:wpc="http://schemas.microsoft.com/office/word/2010/wordprocessingCanvas" xmlns:cx="http://schemas.microsoft.com/office/drawing/2014/chartex" xmlns:cx1="http://schemas.microsoft.com/office/drawing/2015/9/8/chartex" xmlns:cx2="http://schemas.microsoft.com/office/drawing/2015/10/21/chartex" xmlns:cx3="http://schemas.microsoft.com/office/drawing/2016/5/9/chartex" xmlns:cx4="http://schemas.microsoft.com/office/drawing/2016/5/10/chartex" xmlns:cx5="http://schemas.microsoft.com/office/drawing/2016/5/11/chartex" xmlns:cx6="http://schemas.microsoft.com/office/drawing/2016/5/12/chartex" xmlns:cx7="http://schemas.microsoft.com/office/drawing/2016/5/13/chartex" xmlns:cx8="http://schemas.microsoft.com/office/drawing/2016/5/14/chartex" xmlns:mc="http://schemas.openxmlformats.org/markup-compatibility/2006" xmlns:m="http://schemas.openxmlformats.org/officeDocument/2006/math" xmlns:aink="http://schemas.microsoft.com/office/drawing/2016/ink" xmlns:am3d="http://schemas.microsoft.com/office/drawing/2017/model3d" xmlns:oel="http://schemas.microsoft.com/office/2019/extlst" xmlns:r="http://schemas.openxmlformats.org/officeDocument/2006/relationships" xmlns:wp14="http://schemas.microsoft.com/office/word/2010/wordprocessingDrawing" xmlns:wp="http://schemas.openxmlformats.org/drawingml/2006/wordprocessingDrawing" xmlns:wpg="http://schemas.microsoft.com/office/word/2010/wordprocessingGroup" xmlns:wpi="http://schemas.microsoft.com/office/word/2010/wordprocessingInk" xmlns:wps="http://schemas.microsoft.com/office/word/2010/wordprocessingShape" xmlns:o="urn:schemas-microsoft-com:office:office" xmlns:v="urn:schemas-microsoft-com:vml" xmlns:w10="urn:schemas-microsoft-com:office:word" xmlns:w="http://schemas.openxmlformats.org/wordprocessingml/2006/main" xmlns:w14="http://schemas.microsoft.com/office/word/2010/wordml" xmlns:w15="http://schemas.microsoft.com/office/word/2012/wordml" xmlns:w16cex="http://schemas.microsoft.com/office/word/2018/wordml/cex" xmlns:w16cid="http://schemas.microsoft.com/office/word/2016/wordml/cid" xmlns:w16="http://schemas.microsoft.com/office/word/2018/wordml" xmlns:w16sdtdh="http://schemas.microsoft.com/office/word/2020/wordml/sdtdatahash" xmlns:w16sdtfl="http://schemas.microsoft.com/office/word/2024/wordml/sdtformatlock" xmlns:w16se="http://schemas.microsoft.com/office/word/2015/wordml/symex" xmlns:w16du="http://schemas.microsoft.com/office/word/2023/wordml/word16du" xmlns:wne="http://schemas.microsoft.com/office/word/2006/wordml" mc:Ignorable="w14 w15 w16se w16cid w16 w16cex w16sdtdh w16sdtfl w16du wp14">
   <w:abstractNum w:abstractNumId="0" w15:restartNumberingAfterBreak="0">
     <w:nsid w:val="09DC7875"/>
     <w:multiLevelType w:val="multilevel"/>
@@ -9932,7 +10201,7 @@
 </file>
 
 <file path=word/styles.xml><?xml version="1.0" encoding="utf-8"?>
-<w:styles xmlns:mc="http://schemas.openxmlformats.org/markup-compatibility/2006" xmlns:r="http://schemas.openxmlformats.org/officeDocument/2006/relationships" xmlns:w="http://schemas.openxmlformats.org/wordprocessingml/2006/main" xmlns:w14="http://schemas.microsoft.com/office/word/2010/wordml" xmlns:w15="http://schemas.microsoft.com/office/word/2012/wordml" xmlns:w16cex="http://schemas.microsoft.com/office/word/2018/wordml/cex" xmlns:w16cid="http://schemas.microsoft.com/office/word/2016/wordml/cid" xmlns:w16="http://schemas.microsoft.com/office/word/2018/wordml" xmlns:w16du="http://schemas.microsoft.com/office/word/2023/wordml/word16du" xmlns:w16sdtdh="http://schemas.microsoft.com/office/word/2020/wordml/sdtdatahash" xmlns:w16sdtfl="http://schemas.microsoft.com/office/word/2024/wordml/sdtformatlock" xmlns:w16se="http://schemas.microsoft.com/office/word/2015/wordml/symex" mc:Ignorable="w14 w15 w16se w16cid w16 w16cex w16sdtdh w16sdtfl w16du">
+<w:styles xmlns:mc="http://schemas.openxmlformats.org/markup-compatibility/2006" xmlns:r="http://schemas.openxmlformats.org/officeDocument/2006/relationships" xmlns:w="http://schemas.openxmlformats.org/wordprocessingml/2006/main" xmlns:w14="http://schemas.microsoft.com/office/word/2010/wordml" xmlns:w15="http://schemas.microsoft.com/office/word/2012/wordml" xmlns:w16cex="http://schemas.microsoft.com/office/word/2018/wordml/cex" xmlns:w16cid="http://schemas.microsoft.com/office/word/2016/wordml/cid" xmlns:w16="http://schemas.microsoft.com/office/word/2018/wordml" xmlns:w16sdtdh="http://schemas.microsoft.com/office/word/2020/wordml/sdtdatahash" xmlns:w16sdtfl="http://schemas.microsoft.com/office/word/2024/wordml/sdtformatlock" xmlns:w16se="http://schemas.microsoft.com/office/word/2015/wordml/symex" xmlns:w16du="http://schemas.microsoft.com/office/word/2023/wordml/word16du" mc:Ignorable="w14 w15 w16se w16cid w16 w16cex w16sdtdh w16sdtfl w16du">
   <w:docDefaults>
     <w:rPrDefault>
       <w:rPr>

</xml_diff>